<commit_message>
docs: prompt e validação humana dos registros da documentação final
Registros 04 a 24: "Prompt utilizado" como síntese das instruções
(contexto, tarefa, restrições e entrega esperada) e "Validação humana
realizada" dizendo quem validou, o que conferiu, quando e com que
evidências. Layout e demais campos sem mudança; todos com 2 páginas.

Co-Authored-By: Claude Opus 5.5 <noreply@anthropic.com>
</commit_message>
<xml_diff>
--- a/DocumentacaoFinal/INTEGRA_2026_Entrega_7_04_Revisao_Plano_de_Teste_e_Correcoes_API.docx
+++ b/DocumentacaoFinal/INTEGRA_2026_Entrega_7_04_Revisao_Plano_de_Teste_e_Correcoes_API.docx
@@ -605,7 +605,7 @@
                 <w:szCs w:val="17"/>
                 <w:lang w:val="pt-BR"/>
               </w:rPr>
-              <w:t xml:space="preserve">Pedido de Natã da Silva Baracho: revisar o Plano de Teste, apontar o que estava errado ou faltando na API e corrigir, com perguntas antes de alterar o código e um relatório com o resultado dos testes.</w:t>
+              <w:t xml:space="preserve">Síntese das instruções dadas à IA. Contexto: API do lacre em Node.js e SQLite, com um Plano de Teste já escrito. Tarefa: revisar o Plano de Teste, apontar o que está errado ou faltando na API e corrigir. Restrições: fazer as perguntas de regra antes de alterar o código. Entrega esperada: código corrigido, roteiro de teste repetível e relatório com o resultado de cada caso.</w:t>
             </w:r>
           </w:p>
         </w:tc>
@@ -883,7 +883,7 @@
                 <w:szCs w:val="17"/>
                 <w:lang w:val="pt-BR"/>
               </w:rPr>
-              <w:t xml:space="preserve">Compilação (npx tsc --noEmit) sem erros; suíte automatizada com 50 de 50 casos, em duas rodadas; Roteiro executado no oxide.db real, com 77 respostas HTTP iguais ao esperado e o banco restaurado idêntico ao original (checksum SHA-256 igual). Revisão e aprovação por Natã da Silva Baracho, com questionário respondido.</w:t>
+              <w:t xml:space="preserve">Natã da Silva Baracho, responsável pelo backend, leu o relatório de teste e respondeu o questionário de validação. Aprovou em 06/10/2026. Evidências do relatório: compilação sem erros; suíte com 50 de 50 casos; roteiro no oxide.db real, com 77 respostas HTTP iguais ao esperado e o banco restaurado idêntico (checksum igual). Testes executados pela IA; aprovação do responsável.</w:t>
             </w:r>
           </w:p>
         </w:tc>

</xml_diff>